<commit_message>
23103100019-NguyenVuKhanh Update Bao cao module 1
</commit_message>
<xml_diff>
--- a/BaoCao/BaoCao_Module1.docx
+++ b/BaoCao/BaoCao_Module1.docx
@@ -25,7 +25,7 @@
         <w:ind w:firstLine="0"/>
       </w:pPr>
       <w:r>
-        <w:t>Module 1 phụ trách tài khoản, đăng nhập, đăng xuất, phân quyền và quản lý loại bàn trong hệ thống quản lý nhà hàng và đặt bàn. Phạm vi này tạo nền tảng xác định người dùng, duy trì trạng thái làm việc trong phiên và giới hạn các thao tác quản trị theo vai trò. Báo cáo mô tả yêu cầu trong tài liệu đề tài và đối chiếu với phần mã nguồn hiện có của Module 1.</w:t>
+        <w:t xml:space="preserve">Module 1 phụ trách tài khoản, đăng nhập, đăng xuất, phân quyền và quản lý loại bàn trong hệ thống quản lý nhà hàng và đặt bàn. </w:t>
       </w:r>
     </w:p>
     <w:p>
@@ -33,7 +33,16 @@
         <w:ind w:firstLine="0"/>
       </w:pPr>
       <w:r>
-        <w:t>Hai nhóm người dùng được xác định là Admin và User. Admin thực hiện các thao tác quản trị được phân quyền, trong đó có quản lý loại bàn; User là khách hàng sử dụng các chức năng phía khách hàng. Việc đăng ký công khai chỉ tạo tài khoản User. Tài khoản Admin được tạo bằng cơ chế seeder dành cho dữ liệu khởi tạo hoặc kiểm thử.</w:t>
+        <w:t>Hai nhóm người dùng được xác định là Admin và User. Admin thực hiện các thao tác quản trị được phân quyền</w:t>
+      </w:r>
+      <w:r>
+        <w:rPr>
+          <w:lang w:val="vi-VN"/>
+        </w:rPr>
+        <w:t xml:space="preserve"> trong tài liệu</w:t>
+      </w:r>
+      <w:r>
+        <w:t>; User là khách hàng sử dụng các chức năng phía khách hàng. Việc đăng ký công khai chỉ tạo tài khoản User. Tài khoản Admin được tạo bằng cơ chế seeder.</w:t>
       </w:r>
     </w:p>
     <w:p>
@@ -70,46 +79,6 @@
       <w:r>
         <w:t>Entity TaiKhoan lưu mã tài khoản, tên đăng nhập, mật khẩu, họ tên, email, vai trò và trạng thái. Tên đăng nhập là thông tin định danh dùng khi đăng nhập; email phải đúng định dạng; vai trò xác định tập quyền; trạng thái cho biết tài khoản có được phép sử dụng hay không. Tài liệu yêu cầu tên đăng nhập không trùng, các trường bắt buộc phải có giá trị và tài khoản bị khóa không được đăng nhập.</w:t>
       </w:r>
-    </w:p>
-    <w:p>
-      <w:pPr>
-        <w:ind w:firstLine="0"/>
-        <w:rPr>
-          <w:lang w:val="vi-VN"/>
-        </w:rPr>
-      </w:pPr>
-    </w:p>
-    <w:p>
-      <w:pPr>
-        <w:ind w:firstLine="0"/>
-        <w:rPr>
-          <w:lang w:val="vi-VN"/>
-        </w:rPr>
-      </w:pPr>
-    </w:p>
-    <w:p>
-      <w:pPr>
-        <w:ind w:firstLine="0"/>
-        <w:rPr>
-          <w:lang w:val="vi-VN"/>
-        </w:rPr>
-      </w:pPr>
-    </w:p>
-    <w:p>
-      <w:pPr>
-        <w:ind w:firstLine="0"/>
-        <w:rPr>
-          <w:lang w:val="vi-VN"/>
-        </w:rPr>
-      </w:pPr>
-    </w:p>
-    <w:p>
-      <w:pPr>
-        <w:ind w:firstLine="0"/>
-        <w:rPr>
-          <w:lang w:val="vi-VN"/>
-        </w:rPr>
-      </w:pPr>
     </w:p>
     <w:tbl>
       <w:tblPr>
@@ -143,7 +112,6 @@
                 <w:color w:val="000000" w:themeColor="text1"/>
                 <w:sz w:val="24"/>
               </w:rPr>
-              <w:lastRenderedPageBreak/>
               <w:t>Thuộc tính</w:t>
             </w:r>
           </w:p>
@@ -674,9 +642,11 @@
     <w:p>
       <w:pPr>
         <w:ind w:firstLine="0"/>
+        <w:rPr>
+          <w:lang w:val="vi-VN"/>
+        </w:rPr>
       </w:pPr>
       <w:r>
-        <w:lastRenderedPageBreak/>
         <w:t>Session là dữ liệu nền để các request sau nhận biết người dùng. Trang chủ đọc VaiTro trong Session để trả về giao diện Admin hoặc Client. Giá trị vai trò được thống nhất với enum: Admin hoặc User, trong đó Admin được kiểm tra bằng nameof(VaiTro.Admin).</w:t>
       </w:r>
     </w:p>
@@ -698,7 +668,31 @@
         <w:ind w:firstLine="0"/>
       </w:pPr>
       <w:r>
-        <w:t>Action DangXuat xóa toàn bộ Session bằng HttpContext.Session.Clear() rồi chuyển người dùng về trang đăng nhập. Sau thao tác này, các chức năng yêu cầu đăng nhập không còn nhận được MaTaiKhoan và người dùng phải xác thực lại.</w:t>
+        <w:t>Action DangXuat xóa toàn bộ Session bằng HttpContext.Session.Clear() rồi chuyển người dùng về trang đăng nhập. Sau thao tác này, các chức năng yêu cầu đăng nhập không còn nhận được MaTaiKhoan</w:t>
+      </w:r>
+      <w:r>
+        <w:t xml:space="preserve"> do session đã</w:t>
+      </w:r>
+      <w:r>
+        <w:rPr>
+          <w:lang w:val="vi-VN"/>
+        </w:rPr>
+        <w:t xml:space="preserve"> bị xóa</w:t>
+      </w:r>
+      <w:r>
+        <w:t xml:space="preserve"> và người dùng phải </w:t>
+      </w:r>
+      <w:r>
+        <w:t>đăng</w:t>
+      </w:r>
+      <w:r>
+        <w:rPr>
+          <w:lang w:val="vi-VN"/>
+        </w:rPr>
+        <w:t xml:space="preserve"> nhập</w:t>
+      </w:r>
+      <w:r>
+        <w:t xml:space="preserve"> lại.</w:t>
       </w:r>
     </w:p>
     <w:p>
@@ -711,6 +705,7 @@
         <w:rPr>
           <w:rFonts w:ascii="Times New Roman" w:eastAsia="Times New Roman" w:hAnsi="Times New Roman"/>
         </w:rPr>
+        <w:lastRenderedPageBreak/>
         <w:t>Phân quyền</w:t>
       </w:r>
     </w:p>
@@ -719,13 +714,14 @@
         <w:ind w:firstLine="0"/>
       </w:pPr>
       <w:r>
-        <w:t>Phân quyền được kiểm tra ở Controller, không chỉ dựa vào việc ẩn menu trên giao diện. LoaiBanController kiểm tra MaTaiKhoan trong Session; request không có phiên đăng nhập bị chuyển đến Account/Login, còn User bị trả mã trạng thái HTTP 403. Chỉ Admin được tiếp tục xử lý các action quản lý loại bàn.</w:t>
+        <w:t>Phân quyền được kiểm tra ở Controller. LoaiBanController kiểm tra MaTaiKhoan trong Session; request không có phiên đăng nhập bị chuyển đến Account/Login, còn User bị trả mã trạng thái HTTP 403. Chỉ Admin được tiếp tục xử lý các action quản lý loại bàn.</w:t>
       </w:r>
     </w:p>
     <w:tbl>
       <w:tblPr>
         <w:tblStyle w:val="TableGrid"/>
         <w:tblW w:w="8787" w:type="dxa"/>
+        <w:jc w:val="center"/>
         <w:tblLook w:val="04A0" w:firstRow="1" w:lastRow="0" w:firstColumn="1" w:lastColumn="0" w:noHBand="0" w:noVBand="1"/>
       </w:tblPr>
       <w:tblGrid>
@@ -734,6 +730,9 @@
         <w:gridCol w:w="2619"/>
       </w:tblGrid>
       <w:tr>
+        <w:trPr>
+          <w:jc w:val="center"/>
+        </w:trPr>
         <w:tc>
           <w:tcPr>
             <w:tcW w:w="1474" w:type="dxa"/>
@@ -805,6 +804,9 @@
         </w:tc>
       </w:tr>
       <w:tr>
+        <w:trPr>
+          <w:jc w:val="center"/>
+        </w:trPr>
         <w:tc>
           <w:tcPr>
             <w:tcW w:w="1474" w:type="dxa"/>
@@ -847,17 +849,31 @@
             <w:pPr>
               <w:spacing w:after="0" w:line="276" w:lineRule="auto"/>
               <w:ind w:firstLine="0"/>
+              <w:jc w:val="left"/>
+              <w:rPr>
+                <w:lang w:val="vi-VN"/>
+              </w:rPr>
             </w:pPr>
             <w:r>
               <w:rPr>
                 <w:sz w:val="24"/>
               </w:rPr>
-              <w:t>VaiTro trong Session bằng Admin.</w:t>
+              <w:t>VaiTro</w:t>
+            </w:r>
+            <w:r>
+              <w:rPr>
+                <w:sz w:val="24"/>
+                <w:lang w:val="vi-VN"/>
+              </w:rPr>
+              <w:t xml:space="preserve"> trong phiên đăng nhập hiện tại có là Amdin không</w:t>
             </w:r>
           </w:p>
         </w:tc>
       </w:tr>
       <w:tr>
+        <w:trPr>
+          <w:jc w:val="center"/>
+        </w:trPr>
         <w:tc>
           <w:tcPr>
             <w:tcW w:w="1474" w:type="dxa"/>
@@ -901,12 +917,32 @@
               <w:keepNext/>
               <w:spacing w:after="0" w:line="276" w:lineRule="auto"/>
               <w:ind w:firstLine="0"/>
+              <w:jc w:val="left"/>
             </w:pPr>
             <w:r>
               <w:rPr>
                 <w:sz w:val="24"/>
               </w:rPr>
-              <w:t>VaiTro trong Session không phải Admin; trả 403 khi vào khu vực quản trị.</w:t>
+              <w:t xml:space="preserve">VaiTro trong </w:t>
+            </w:r>
+            <w:r>
+              <w:rPr>
+                <w:sz w:val="24"/>
+              </w:rPr>
+              <w:t>phiên</w:t>
+            </w:r>
+            <w:r>
+              <w:rPr>
+                <w:sz w:val="24"/>
+                <w:lang w:val="vi-VN"/>
+              </w:rPr>
+              <w:t xml:space="preserve"> đăng nhập hiện tại </w:t>
+            </w:r>
+            <w:r>
+              <w:rPr>
+                <w:sz w:val="24"/>
+              </w:rPr>
+              <w:t>không phải Admin; trả 403 khi vào khu vực quản trị.</w:t>
             </w:r>
           </w:p>
         </w:tc>
@@ -915,7 +951,8 @@
     <w:p>
       <w:pPr>
         <w:pStyle w:val="Caption"/>
-        <w:ind w:left="1440" w:firstLine="720"/>
+        <w:ind w:firstLine="0"/>
+        <w:jc w:val="center"/>
         <w:rPr>
           <w:b w:val="0"/>
           <w:bCs w:val="0"/>
@@ -975,30 +1012,13 @@
     <w:p>
       <w:pPr>
         <w:ind w:firstLine="0"/>
+        <w:rPr>
+          <w:lang w:val="vi-VN"/>
+        </w:rPr>
       </w:pPr>
       <w:r>
         <w:t>LoaiBan là danh mục phục vụ việc phân loại bàn ăn. Entity gồm MaLoaiBan, TenLoaiBan, MoTa và TrangThai. Admin có thể xem danh sách, xem chi tiết, thêm mới, chỉnh sửa, xóa và chuyển trạng thái. Tên loại bàn là bắt buộc và tối đa 100 ký tự; mô tả có thể để trống và tối đa 500 ký tự; trạng thái biểu diễn hoạt động hoặc ngừng hoạt động.</w:t>
       </w:r>
-    </w:p>
-    <w:p>
-      <w:pPr>
-        <w:pStyle w:val="Caption"/>
-        <w:keepNext/>
-        <w:spacing w:before="120" w:after="80"/>
-        <w:ind w:firstLine="0"/>
-        <w:rPr>
-          <w:color w:val="000000"/>
-          <w:sz w:val="24"/>
-          <w:lang w:val="vi-VN"/>
-        </w:rPr>
-      </w:pPr>
-    </w:p>
-    <w:p>
-      <w:pPr>
-        <w:rPr>
-          <w:lang w:val="vi-VN"/>
-        </w:rPr>
-      </w:pPr>
     </w:p>
     <w:tbl>
       <w:tblPr>
@@ -1031,7 +1051,6 @@
                 <w:color w:val="000000" w:themeColor="text1"/>
                 <w:sz w:val="24"/>
               </w:rPr>
-              <w:lastRenderedPageBreak/>
               <w:t>Thuộc tính</w:t>
             </w:r>
           </w:p>
@@ -1416,7 +1435,11 @@
         <w:ind w:firstLine="0"/>
       </w:pPr>
       <w:r>
-        <w:t>LoaiBanController nhận ILoaiBanService qua dependency injection. Service xử lý kiểm tra dữ liệu, kiểm tra tên trùng và chuyển đổi request sang entity. Repository thực hiện truy vấn Entity Framework Core, đọc danh sách theo tên, thêm, sửa, xóa và tìm kiếm theo mã. Khi sửa, repository chỉ cập nhật các trường TenLoaiBan, MoTa và TrangThai để giữ nguyên khóa chính.</w:t>
+        <w:t xml:space="preserve">LoaiBanController nhận ILoaiBanService qua dependency injection. Service xử lý kiểm tra dữ liệu, kiểm tra tên trùng và chuyển đổi request sang entity. Repository thực hiện truy vấn Entity Framework Core, đọc danh sách theo tên, thêm, sửa, xóa </w:t>
+      </w:r>
+      <w:r>
+        <w:lastRenderedPageBreak/>
+        <w:t>và tìm kiếm theo mã. Khi sửa, repository chỉ cập nhật các trường TenLoaiBan, MoTa và TrangThai để giữ nguyên khóa chính.</w:t>
       </w:r>
     </w:p>
     <w:p>
@@ -1546,7 +1569,6 @@
         </w:numPr>
       </w:pPr>
       <w:r>
-        <w:lastRenderedPageBreak/>
         <w:t>Repository truy vấn tài khoản; LoginService kiểm tra trạng thái và xác minh hash.</w:t>
       </w:r>
     </w:p>
@@ -1620,7 +1642,25 @@
         </w:numPr>
       </w:pPr>
       <w:r>
-        <w:t>Admin chọn thêm hoặc sửa; form dùng input cho tên, textarea cho mô tả và select cho trạng thái.</w:t>
+        <w:t>Admin chọn thêm hoặc sửa; form dùng input cho tên</w:t>
+      </w:r>
+      <w:r>
+        <w:rPr>
+          <w:lang w:val="vi-VN"/>
+        </w:rPr>
+        <w:t xml:space="preserve"> loại bàn</w:t>
+      </w:r>
+      <w:r>
+        <w:t>, textarea cho mô tả và select cho trạng thái</w:t>
+      </w:r>
+      <w:r>
+        <w:rPr>
+          <w:lang w:val="vi-VN"/>
+        </w:rPr>
+        <w:t xml:space="preserve"> loại bàn</w:t>
+      </w:r>
+      <w:r>
+        <w:t>.</w:t>
       </w:r>
     </w:p>
     <w:p>
@@ -1668,6 +1708,7 @@
         </w:numPr>
       </w:pPr>
       <w:r>
+        <w:lastRenderedPageBreak/>
         <w:t>Xóa chỉ xảy ra sau bước xác nhận và được chặn nếu vi phạm khóa ngoại.</w:t>
       </w:r>
     </w:p>
@@ -1717,18 +1758,16 @@
         <w:jc w:val="both"/>
         <w:rPr>
           <w:rFonts w:ascii="Times New Roman" w:eastAsia="Times New Roman" w:hAnsi="Times New Roman"/>
+          <w:lang w:val="vi-VN"/>
         </w:rPr>
       </w:pPr>
       <w:r>
         <w:rPr>
           <w:rFonts w:ascii="Times New Roman" w:eastAsia="Times New Roman" w:hAnsi="Times New Roman"/>
         </w:rPr>
-        <w:lastRenderedPageBreak/>
         <w:t>Thiết kế thành phần và giao diện</w:t>
       </w:r>
     </w:p>
-    <w:p/>
-    <w:p/>
     <w:tbl>
       <w:tblPr>
         <w:tblStyle w:val="TableGrid"/>
@@ -2161,6 +2200,7 @@
         <w:ind w:firstLine="0"/>
       </w:pPr>
       <w:r>
+        <w:lastRenderedPageBreak/>
         <w:t>ClientLayout chứa điều hướng phía khách hàng, liên kết tài khoản và vùng RenderBody cho View con. AdminLayout dùng sidebar cho Dashboard, LoaiBan và các mục module khác sẽ nối sau</w:t>
       </w:r>
       <w:r>

</xml_diff>